<commit_message>
Added refereces source and document
</commit_message>
<xml_diff>
--- a/document/references-document/einvoicehub_softz/By SoftZ/API INTEGRATION DOCUMENTATION.docx
+++ b/document/references-document/einvoicehub_softz/By SoftZ/API INTEGRATION DOCUMENTATION.docx
@@ -538,9 +538,10 @@
             </w:r>
             <w:r>
               <w:rPr>
-                <w:rStyle w:val="Hyperlink"/>
-              </w:rPr>
-              <w:t>3</w:t>
+                <w:rFonts w:hint="eastAsia"/>
+                <w:noProof/>
+              </w:rPr>
+              <w:t>4</w:t>
             </w:r>
             <w:r>
               <w:fldChar w:fldCharType="end"/>
@@ -592,7 +593,8 @@
             </w:r>
             <w:r>
               <w:rPr>
-                <w:rStyle w:val="Hyperlink"/>
+                <w:rFonts w:hint="eastAsia"/>
+                <w:noProof/>
               </w:rPr>
               <w:t>4</w:t>
             </w:r>
@@ -646,7 +648,8 @@
             </w:r>
             <w:r>
               <w:rPr>
-                <w:rStyle w:val="Hyperlink"/>
+                <w:rFonts w:hint="eastAsia"/>
+                <w:noProof/>
               </w:rPr>
               <w:t>4</w:t>
             </w:r>
@@ -700,7 +703,8 @@
             </w:r>
             <w:r>
               <w:rPr>
-                <w:rStyle w:val="Hyperlink"/>
+                <w:rFonts w:hint="eastAsia"/>
+                <w:noProof/>
               </w:rPr>
               <w:t>4</w:t>
             </w:r>
@@ -754,7 +758,8 @@
             </w:r>
             <w:r>
               <w:rPr>
-                <w:rStyle w:val="Hyperlink"/>
+                <w:rFonts w:hint="eastAsia"/>
+                <w:noProof/>
               </w:rPr>
               <w:t>4</w:t>
             </w:r>
@@ -808,7 +813,8 @@
             </w:r>
             <w:r>
               <w:rPr>
-                <w:rStyle w:val="Hyperlink"/>
+                <w:rFonts w:hint="eastAsia"/>
+                <w:noProof/>
               </w:rPr>
               <w:t>4</w:t>
             </w:r>
@@ -862,7 +868,8 @@
             </w:r>
             <w:r>
               <w:rPr>
-                <w:rStyle w:val="Hyperlink"/>
+                <w:rFonts w:hint="eastAsia"/>
+                <w:noProof/>
               </w:rPr>
               <w:t>5</w:t>
             </w:r>
@@ -916,7 +923,8 @@
             </w:r>
             <w:r>
               <w:rPr>
-                <w:rStyle w:val="Hyperlink"/>
+                <w:rFonts w:hint="eastAsia"/>
+                <w:noProof/>
               </w:rPr>
               <w:t>5</w:t>
             </w:r>
@@ -970,7 +978,8 @@
             </w:r>
             <w:r>
               <w:rPr>
-                <w:rStyle w:val="Hyperlink"/>
+                <w:rFonts w:hint="eastAsia"/>
+                <w:noProof/>
               </w:rPr>
               <w:t>5</w:t>
             </w:r>
@@ -1024,7 +1033,8 @@
             </w:r>
             <w:r>
               <w:rPr>
-                <w:rStyle w:val="Hyperlink"/>
+                <w:rFonts w:hint="eastAsia"/>
+                <w:noProof/>
               </w:rPr>
               <w:t>7</w:t>
             </w:r>
@@ -1078,9 +1088,10 @@
             </w:r>
             <w:r>
               <w:rPr>
-                <w:rStyle w:val="Hyperlink"/>
-              </w:rPr>
-              <w:t>7</w:t>
+                <w:rFonts w:hint="eastAsia"/>
+                <w:noProof/>
+              </w:rPr>
+              <w:t>9</w:t>
             </w:r>
             <w:r>
               <w:fldChar w:fldCharType="end"/>
@@ -1132,9 +1143,10 @@
             </w:r>
             <w:r>
               <w:rPr>
-                <w:rStyle w:val="Hyperlink"/>
-              </w:rPr>
-              <w:t>7</w:t>
+                <w:rFonts w:hint="eastAsia"/>
+                <w:noProof/>
+              </w:rPr>
+              <w:t>14</w:t>
             </w:r>
             <w:r>
               <w:fldChar w:fldCharType="end"/>
@@ -1186,9 +1198,10 @@
             </w:r>
             <w:r>
               <w:rPr>
-                <w:rStyle w:val="Hyperlink"/>
-              </w:rPr>
-              <w:t>7</w:t>
+                <w:rFonts w:hint="eastAsia"/>
+                <w:noProof/>
+              </w:rPr>
+              <w:t>14</w:t>
             </w:r>
             <w:r>
               <w:fldChar w:fldCharType="end"/>
@@ -1240,9 +1253,10 @@
             </w:r>
             <w:r>
               <w:rPr>
-                <w:rStyle w:val="Hyperlink"/>
-              </w:rPr>
-              <w:t>7</w:t>
+                <w:rFonts w:hint="eastAsia"/>
+                <w:noProof/>
+              </w:rPr>
+              <w:t>14</w:t>
             </w:r>
             <w:r>
               <w:fldChar w:fldCharType="end"/>
@@ -1294,9 +1308,10 @@
             </w:r>
             <w:r>
               <w:rPr>
-                <w:rStyle w:val="Hyperlink"/>
-              </w:rPr>
-              <w:t>7</w:t>
+                <w:rFonts w:hint="eastAsia"/>
+                <w:noProof/>
+              </w:rPr>
+              <w:t>14</w:t>
             </w:r>
             <w:r>
               <w:fldChar w:fldCharType="end"/>
@@ -1348,9 +1363,10 @@
             </w:r>
             <w:r>
               <w:rPr>
-                <w:rStyle w:val="Hyperlink"/>
-              </w:rPr>
-              <w:t>7</w:t>
+                <w:rFonts w:hint="eastAsia"/>
+                <w:noProof/>
+              </w:rPr>
+              <w:t>14</w:t>
             </w:r>
             <w:r>
               <w:fldChar w:fldCharType="end"/>
@@ -1402,9 +1418,10 @@
             </w:r>
             <w:r>
               <w:rPr>
-                <w:rStyle w:val="Hyperlink"/>
-              </w:rPr>
-              <w:t>7</w:t>
+                <w:rFonts w:hint="eastAsia"/>
+                <w:noProof/>
+              </w:rPr>
+              <w:t>14</w:t>
             </w:r>
             <w:r>
               <w:fldChar w:fldCharType="end"/>
@@ -1456,9 +1473,10 @@
             </w:r>
             <w:r>
               <w:rPr>
-                <w:rStyle w:val="Hyperlink"/>
-              </w:rPr>
-              <w:t>8</w:t>
+                <w:rFonts w:hint="eastAsia"/>
+                <w:noProof/>
+              </w:rPr>
+              <w:t>15</w:t>
             </w:r>
             <w:r>
               <w:fldChar w:fldCharType="end"/>
@@ -1510,9 +1528,10 @@
             </w:r>
             <w:r>
               <w:rPr>
-                <w:rStyle w:val="Hyperlink"/>
-              </w:rPr>
-              <w:t>8</w:t>
+                <w:rFonts w:hint="eastAsia"/>
+                <w:noProof/>
+              </w:rPr>
+              <w:t>15</w:t>
             </w:r>
             <w:r>
               <w:fldChar w:fldCharType="end"/>
@@ -1564,9 +1583,10 @@
             </w:r>
             <w:r>
               <w:rPr>
-                <w:rStyle w:val="Hyperlink"/>
-              </w:rPr>
-              <w:t>8</w:t>
+                <w:rFonts w:hint="eastAsia"/>
+                <w:noProof/>
+              </w:rPr>
+              <w:t>15</w:t>
             </w:r>
             <w:r>
               <w:fldChar w:fldCharType="end"/>
@@ -1618,9 +1638,10 @@
             </w:r>
             <w:r>
               <w:rPr>
-                <w:rStyle w:val="Hyperlink"/>
-              </w:rPr>
-              <w:t>8</w:t>
+                <w:rFonts w:hint="eastAsia"/>
+                <w:noProof/>
+              </w:rPr>
+              <w:t>15</w:t>
             </w:r>
             <w:r>
               <w:fldChar w:fldCharType="end"/>
@@ -1672,9 +1693,10 @@
             </w:r>
             <w:r>
               <w:rPr>
-                <w:rStyle w:val="Hyperlink"/>
-              </w:rPr>
-              <w:t>9</w:t>
+                <w:rFonts w:hint="eastAsia"/>
+                <w:noProof/>
+              </w:rPr>
+              <w:t>16</w:t>
             </w:r>
             <w:r>
               <w:fldChar w:fldCharType="end"/>
@@ -6974,14 +6996,12 @@
                 <w:rFonts w:ascii="Times New Roman" w:eastAsia="Times New Roman" w:hAnsi="Times New Roman" w:cs="Times New Roman"/>
               </w:rPr>
             </w:pPr>
-            <w:bookmarkStart w:id="26" w:name="_GoBack"/>
             <w:r>
               <w:rPr>
                 <w:rFonts w:ascii="Times New Roman" w:eastAsia="Times New Roman" w:hAnsi="Times New Roman" w:cs="Times New Roman"/>
               </w:rPr>
               <w:t>TaxAmount</w:t>
             </w:r>
-            <w:bookmarkEnd w:id="26"/>
           </w:p>
         </w:tc>
         <w:tc>
@@ -9288,8 +9308,8 @@
           <w:szCs w:val="28"/>
         </w:rPr>
       </w:pPr>
-      <w:bookmarkStart w:id="27" w:name="_Toc430063942"/>
-      <w:bookmarkStart w:id="28" w:name="_Toc1558641731"/>
+      <w:bookmarkStart w:id="26" w:name="_Toc430063942"/>
+      <w:bookmarkStart w:id="27" w:name="_Toc1558641731"/>
       <w:r>
         <w:rPr>
           <w:rFonts w:ascii="Times New Roman" w:eastAsia="Times New Roman" w:hAnsi="Times New Roman" w:cs="Times New Roman"/>
@@ -9320,8 +9340,8 @@
         </w:rPr>
         <w:t>s</w:t>
       </w:r>
+      <w:bookmarkEnd w:id="26"/>
       <w:bookmarkEnd w:id="27"/>
-      <w:bookmarkEnd w:id="28"/>
     </w:p>
     <w:p>
       <w:pPr>
@@ -12762,8 +12782,8 @@
           <w:szCs w:val="28"/>
         </w:rPr>
       </w:pPr>
-      <w:bookmarkStart w:id="29" w:name="_Toc1904764798"/>
-      <w:bookmarkStart w:id="30" w:name="_Toc1702154217"/>
+      <w:bookmarkStart w:id="28" w:name="_Toc1904764798"/>
+      <w:bookmarkStart w:id="29" w:name="_Toc1702154217"/>
       <w:r>
         <w:rPr>
           <w:rFonts w:ascii="Times New Roman" w:eastAsia="Times New Roman" w:hAnsi="Times New Roman" w:cs="Times New Roman"/>
@@ -12804,8 +12824,8 @@
         </w:rPr>
         <w:t>s</w:t>
       </w:r>
+      <w:bookmarkEnd w:id="28"/>
       <w:bookmarkEnd w:id="29"/>
-      <w:bookmarkEnd w:id="30"/>
     </w:p>
     <w:p>
       <w:pPr>
@@ -18825,6 +18845,16 @@
               <w:t>N</w:t>
             </w:r>
           </w:p>
+          <w:p>
+            <w:pPr>
+              <w:spacing w:after="0"/>
+              <w:rPr>
+                <w:rFonts w:ascii="Times New Roman" w:eastAsia="Times New Roman" w:hAnsi="Times New Roman" w:cs="Times New Roman"/>
+              </w:rPr>
+            </w:pPr>
+            <w:bookmarkStart w:id="30" w:name="_GoBack"/>
+            <w:bookmarkEnd w:id="30"/>
+          </w:p>
         </w:tc>
         <w:tc>
           <w:tcPr>
@@ -19853,6 +19883,7 @@
               <w:rPr>
                 <w:rFonts w:ascii="Times New Roman" w:eastAsia="Times New Roman" w:hAnsi="Times New Roman" w:cs="Times New Roman"/>
               </w:rPr>
+              <w:lastRenderedPageBreak/>
               <w:t>3</w:t>
             </w:r>
           </w:p>
@@ -19982,7 +20013,6 @@
               <w:rPr>
                 <w:rFonts w:ascii="Times New Roman" w:eastAsia="Times New Roman" w:hAnsi="Times New Roman" w:cs="Times New Roman"/>
               </w:rPr>
-              <w:lastRenderedPageBreak/>
               <w:t>3</w:t>
             </w:r>
           </w:p>
@@ -22284,6 +22314,7 @@
               <w:rPr>
                 <w:rFonts w:ascii="Times New Roman" w:eastAsia="Times New Roman" w:hAnsi="Times New Roman" w:cs="Times New Roman"/>
               </w:rPr>
+              <w:lastRenderedPageBreak/>
               <w:t>1</w:t>
             </w:r>
           </w:p>
@@ -22384,7 +22415,6 @@
               <w:rPr>
                 <w:rFonts w:ascii="Times New Roman" w:eastAsia="Times New Roman" w:hAnsi="Times New Roman" w:cs="Times New Roman"/>
               </w:rPr>
-              <w:lastRenderedPageBreak/>
               <w:t>1</w:t>
             </w:r>
           </w:p>
@@ -26613,7 +26643,7 @@
         <w:tc>
           <w:tcPr>
             <w:tcW w:w="1075" w:type="dxa"/>
-            <w:shd w:val="clear" w:color="auto" w:fill="FFFF00"/>
+            <w:shd w:val="clear" w:color="auto" w:fill="auto"/>
           </w:tcPr>
           <w:p>
             <w:pPr>
@@ -26633,7 +26663,7 @@
         <w:tc>
           <w:tcPr>
             <w:tcW w:w="2610" w:type="dxa"/>
-            <w:shd w:val="clear" w:color="auto" w:fill="FFFF00"/>
+            <w:shd w:val="clear" w:color="auto" w:fill="auto"/>
           </w:tcPr>
           <w:p>
             <w:pPr>
@@ -26654,7 +26684,7 @@
         <w:tc>
           <w:tcPr>
             <w:tcW w:w="975" w:type="dxa"/>
-            <w:shd w:val="clear" w:color="auto" w:fill="FFFF00"/>
+            <w:shd w:val="clear" w:color="auto" w:fill="auto"/>
           </w:tcPr>
           <w:p>
             <w:pPr>
@@ -26674,7 +26704,7 @@
         <w:tc>
           <w:tcPr>
             <w:tcW w:w="1485" w:type="dxa"/>
-            <w:shd w:val="clear" w:color="auto" w:fill="FFFF00"/>
+            <w:shd w:val="clear" w:color="auto" w:fill="auto"/>
           </w:tcPr>
           <w:p>
             <w:pPr>
@@ -26694,7 +26724,7 @@
         <w:tc>
           <w:tcPr>
             <w:tcW w:w="3645" w:type="dxa"/>
-            <w:shd w:val="clear" w:color="auto" w:fill="FFFF00"/>
+            <w:shd w:val="clear" w:color="auto" w:fill="auto"/>
           </w:tcPr>
           <w:p>
             <w:pPr>
@@ -26713,6 +26743,7 @@
         <w:tc>
           <w:tcPr>
             <w:tcW w:w="1075" w:type="dxa"/>
+            <w:shd w:val="clear" w:color="auto" w:fill="auto"/>
           </w:tcPr>
           <w:p>
             <w:pPr>
@@ -26732,6 +26763,7 @@
         <w:tc>
           <w:tcPr>
             <w:tcW w:w="2610" w:type="dxa"/>
+            <w:shd w:val="clear" w:color="auto" w:fill="auto"/>
           </w:tcPr>
           <w:p>
             <w:pPr>
@@ -26752,6 +26784,7 @@
         <w:tc>
           <w:tcPr>
             <w:tcW w:w="975" w:type="dxa"/>
+            <w:shd w:val="clear" w:color="auto" w:fill="auto"/>
           </w:tcPr>
           <w:p>
             <w:pPr>
@@ -26771,6 +26804,7 @@
         <w:tc>
           <w:tcPr>
             <w:tcW w:w="1485" w:type="dxa"/>
+            <w:shd w:val="clear" w:color="auto" w:fill="auto"/>
           </w:tcPr>
           <w:p>
             <w:pPr>
@@ -26790,6 +26824,7 @@
         <w:tc>
           <w:tcPr>
             <w:tcW w:w="3645" w:type="dxa"/>
+            <w:shd w:val="clear" w:color="auto" w:fill="auto"/>
           </w:tcPr>
           <w:p>
             <w:pPr>
@@ -26903,7 +26938,7 @@
         <w:tc>
           <w:tcPr>
             <w:tcW w:w="1075" w:type="dxa"/>
-            <w:shd w:val="clear" w:color="auto" w:fill="FFFF00"/>
+            <w:shd w:val="clear" w:color="auto" w:fill="auto"/>
           </w:tcPr>
           <w:p>
             <w:pPr>
@@ -26923,7 +26958,7 @@
         <w:tc>
           <w:tcPr>
             <w:tcW w:w="2610" w:type="dxa"/>
-            <w:shd w:val="clear" w:color="auto" w:fill="FFFF00"/>
+            <w:shd w:val="clear" w:color="auto" w:fill="auto"/>
           </w:tcPr>
           <w:p>
             <w:pPr>
@@ -26944,7 +26979,7 @@
         <w:tc>
           <w:tcPr>
             <w:tcW w:w="975" w:type="dxa"/>
-            <w:shd w:val="clear" w:color="auto" w:fill="FFFF00"/>
+            <w:shd w:val="clear" w:color="auto" w:fill="auto"/>
           </w:tcPr>
           <w:p>
             <w:pPr>
@@ -26964,7 +26999,7 @@
         <w:tc>
           <w:tcPr>
             <w:tcW w:w="1485" w:type="dxa"/>
-            <w:shd w:val="clear" w:color="auto" w:fill="FFFF00"/>
+            <w:shd w:val="clear" w:color="auto" w:fill="auto"/>
           </w:tcPr>
           <w:p>
             <w:pPr>
@@ -26984,7 +27019,7 @@
         <w:tc>
           <w:tcPr>
             <w:tcW w:w="3645" w:type="dxa"/>
-            <w:shd w:val="clear" w:color="auto" w:fill="FFFF00"/>
+            <w:shd w:val="clear" w:color="auto" w:fill="auto"/>
           </w:tcPr>
           <w:p>
             <w:pPr>
@@ -31795,7 +31830,7 @@
         <w:noProof/>
         <w:color w:val="156082" w:themeColor="accent1"/>
       </w:rPr>
-      <w:t>16</w:t>
+      <w:t>11</w:t>
     </w:r>
     <w:r>
       <w:rPr>
@@ -32958,7 +32993,7 @@
       <w:lvlText w:val="%1.%2."/>
       <w:lvlJc w:val="left"/>
       <w:pPr>
-        <w:ind w:left="1440" w:hanging="360"/>
+        <w:ind w:left="360" w:hanging="360"/>
       </w:pPr>
     </w:lvl>
     <w:lvl w:ilvl="2">
@@ -35862,7 +35897,7 @@
 </file>
 
 <file path=customXml/itemProps4.xml><?xml version="1.0" encoding="utf-8"?>
-<ds:datastoreItem xmlns:ds="http://schemas.openxmlformats.org/officeDocument/2006/customXml" ds:itemID="{F691789D-8B7E-457B-8421-010588E3A847}">
+<ds:datastoreItem xmlns:ds="http://schemas.openxmlformats.org/officeDocument/2006/customXml" ds:itemID="{E138D88C-870B-4D87-9DC6-D79B21AFF53E}">
   <ds:schemaRefs>
     <ds:schemaRef ds:uri="http://schemas.openxmlformats.org/officeDocument/2006/bibliography"/>
   </ds:schemaRefs>

</xml_diff>